<commit_message>
Se acomodan los ejercicos para que cada ejercicio empiece una vez finlizado el tema. Se agregan correcciones al tema 1.5
</commit_message>
<xml_diff>
--- a/salida/Ejercicios_Tema_1_5.docx
+++ b/salida/Ejercicios_Tema_1_5.docx
@@ -162,124 +162,7 @@
             </w:drawing>
           </mc:Choice>
           <mc:Fallback>
-            <w:pict>
-              <v:shapetype w14:anchorId="71A895D2" id="_x0000_t202" coordsize="21600,21600" o:spt="202" path="m,l,21600r21600,l21600,xe">
-                <v:stroke joinstyle="miter"/>
-                <v:path gradientshapeok="t" o:connecttype="rect"/>
-              </v:shapetype>
-              <v:shape id="CuadroTexto 1001" o:spid="_x0000_s1026" type="#_x0000_t202" style="position:absolute;margin-left:0;margin-top:0;width:652pt;height:454.5pt;z-index:251660000;visibility:visible;mso-wrap-style:square;mso-wrap-distance-left:9pt;mso-wrap-distance-top:0;mso-wrap-distance-right:9pt;mso-wrap-distance-bottom:0;mso-position-horizontal:center;mso-position-horizontal-relative:margin;mso-position-vertical:absolute;mso-position-vertical-relative:text;v-text-anchor:top" o:gfxdata="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" filled="f" stroked="f">
-                <v:textbox style="mso-fit-shape-to-text:t">
-                  <w:txbxContent>
-                    <w:p>
-                      <w:pPr>
-                        <w:keepNext/>
-                        <w:spacing w:after="120" w:line="240" w:lineRule="auto"/>
-                        <w:jc w:val="center"/>
-                      </w:pPr>
-                      <w:r>
-                        <w:rPr>
-                          <w:b/>
-                          <w:bCs/>
-                          <w:color w:val="000000"/>
-                          <w:sz w:val="48"/>
-                          <w:szCs w:val="48"/>
-                        </w:rPr>
-                        <w:t>Ejercicios del tema 1.</w:t>
-                      </w:r>
-                      <w:r>
-                        <w:rPr>
-                          <w:b/>
-                          <w:bCs/>
-                          <w:color w:val="000000"/>
-                          <w:sz w:val="48"/>
-                          <w:szCs w:val="48"/>
-                        </w:rPr>
-                        <w:t>5</w:t>
-                      </w:r>
-                      <w:r>
-                        <w:rPr>
-                          <w:b/>
-                          <w:bCs/>
-                          <w:color w:val="000000"/>
-                          <w:sz w:val="48"/>
-                          <w:szCs w:val="48"/>
-                        </w:rPr>
-                        <w:br/>
-                        <w:t>Funciones de un Sistema Manejador de Bases de Datos Relacional (SMBDR)</w:t>
-                      </w:r>
-                    </w:p>
-                    <w:p>
-                      <w:pPr>
-                        <w:spacing w:after="120" w:line="240" w:lineRule="auto"/>
-                        <w:jc w:val="both"/>
-                      </w:pPr>
-                      <w:r>
-                        <w:rPr>
-                          <w:color w:val="000000"/>
-                          <w:sz w:val="48"/>
-                          <w:szCs w:val="48"/>
-                        </w:rPr>
-                        <w:t xml:space="preserve">Resuelve </w:t>
-                      </w:r>
-                      <w:r>
-                        <w:rPr>
-                          <w:color w:val="000000"/>
-                          <w:sz w:val="48"/>
-                          <w:szCs w:val="48"/>
-                        </w:rPr>
-                        <w:t xml:space="preserve">el </w:t>
-                      </w:r>
-                      <w:r>
-                        <w:rPr>
-                          <w:color w:val="000000"/>
-                          <w:sz w:val="48"/>
-                          <w:szCs w:val="48"/>
-                        </w:rPr>
-                        <w:t>ejercicio</w:t>
-                      </w:r>
-                      <w:r>
-                        <w:rPr>
-                          <w:color w:val="000000"/>
-                          <w:sz w:val="48"/>
-                          <w:szCs w:val="48"/>
-                        </w:rPr>
-                        <w:t xml:space="preserve"> con la información del tema. Cada ejercicio tiene una página de enunciado y una página de solución.</w:t>
-                      </w:r>
-                    </w:p>
-                    <w:p>
-                      <w:pPr>
-                        <w:spacing w:after="80" w:line="240" w:lineRule="auto"/>
-                        <w:ind w:left="567" w:hanging="425"/>
-                      </w:pPr>
-                      <w:r>
-                        <w:rPr>
-                          <w:color w:val="000000"/>
-                          <w:sz w:val="48"/>
-                          <w:szCs w:val="48"/>
-                        </w:rPr>
-                        <w:t>•</w:t>
-                      </w:r>
-                      <w:r>
-                        <w:rPr>
-                          <w:color w:val="000000"/>
-                          <w:sz w:val="48"/>
-                          <w:szCs w:val="48"/>
-                        </w:rPr>
-                        <w:tab/>
-                        <w:t>Ejercicio 1. Clasifica las instrucciones.</w:t>
-                      </w:r>
-                    </w:p>
-                    <w:p>
-                      <w:pPr>
-                        <w:spacing w:after="80" w:line="240" w:lineRule="auto"/>
-                        <w:ind w:left="567" w:hanging="425"/>
-                      </w:pPr>
-                    </w:p>
-                  </w:txbxContent>
-                </v:textbox>
-                <w10:wrap anchorx="margin"/>
-              </v:shape>
-            </w:pict>
+            <w:t>[Cuadro de texto]</w:t>
           </mc:Fallback>
         </mc:AlternateContent>
       </w:r>
@@ -471,7 +354,7 @@
                                       <w:sz w:val="48"/>
                                       <w:szCs w:val="48"/>
                                     </w:rPr>
-                                    <w:t>CREATE</w:t>
+                                    <w:t>CREATE TABLE</w:t>
                                   </w:r>
                                 </w:p>
                               </w:tc>
@@ -582,7 +465,7 @@
                                       <w:sz w:val="48"/>
                                       <w:szCs w:val="48"/>
                                     </w:rPr>
-                                    <w:t>ALTER</w:t>
+                                    <w:t>ALTER TABLE</w:t>
                                   </w:r>
                                 </w:p>
                               </w:tc>
@@ -694,6 +577,43 @@
                                       <w:szCs w:val="48"/>
                                     </w:rPr>
                                     <w:t>UPDATE</w:t>
+                                  </w:r>
+                                </w:p>
+                              </w:tc>
+                              <w:tc>
+                                <w:tcPr>
+                                  <w:tcW w:w="8267" w:type="dxa"/>
+                                  <w:vAlign w:val="center"/>
+                                </w:tcPr>
+                                <w:p>
+                                  <w:pPr>
+                                    <w:spacing w:after="0" w:line="240" w:lineRule="auto"/>
+                                  </w:pPr>
+                                </w:p>
+                              </w:tc>
+                            </w:tr>
+                            <w:tr>
+                              <w:trPr>
+                                <w:cantSplit/>
+                                <w:jc w:val="center"/>
+                              </w:trPr>
+                              <w:tc>
+                                <w:tcPr>
+                                  <w:tcW w:w="4133" w:type="dxa"/>
+                                  <w:vAlign w:val="center"/>
+                                </w:tcPr>
+                                <w:p>
+                                  <w:pPr>
+                                    <w:spacing w:after="0" w:line="240" w:lineRule="auto"/>
+                                  </w:pPr>
+                                  <w:r>
+                                    <w:rPr>
+                                      <w:rFonts w:ascii="Consolas" w:hAnsi="Consolas" w:cs="Consolas"/>
+                                      <w:color w:val="000000"/>
+                                      <w:sz w:val="48"/>
+                                      <w:szCs w:val="48"/>
+                                    </w:rPr>
+                                    <w:t>CREATE INDEX</w:t>
                                   </w:r>
                                 </w:p>
                               </w:tc>
@@ -727,91 +647,64 @@
             </w:drawing>
           </mc:Choice>
           <mc:Fallback>
-            <w:pict>
-              <v:shape w14:anchorId="6E8CF586" id="CuadroTexto 1002" o:spid="_x0000_s1027" type="#_x0000_t202" style="position:absolute;margin-left:0;margin-top:0;width:652pt;height:454.5pt;z-index:251660001;visibility:visible;mso-wrap-style:square;mso-wrap-distance-left:9pt;mso-wrap-distance-top:0;mso-wrap-distance-right:9pt;mso-wrap-distance-bottom:0;mso-position-horizontal:center;mso-position-horizontal-relative:margin;mso-position-vertical:absolute;mso-position-vertical-relative:text;v-text-anchor:top" o:gfxdata="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" filled="f" stroked="f">
-                <v:textbox style="mso-fit-shape-to-text:t">
-                  <w:txbxContent>
-                    <w:p>
-                      <w:pPr>
-                        <w:keepNext/>
-                        <w:spacing w:after="120" w:line="240" w:lineRule="auto"/>
-                      </w:pPr>
-                      <w:r>
-                        <w:rPr>
-                          <w:b/>
-                          <w:bCs/>
-                          <w:color w:val="000000"/>
-                          <w:sz w:val="48"/>
-                          <w:szCs w:val="48"/>
-                        </w:rPr>
-                        <w:t>Ejercicio 1. Clasifica las instrucciones</w:t>
-                      </w:r>
-                    </w:p>
-                    <w:p>
-                      <w:pPr>
-                        <w:keepNext/>
-                        <w:spacing w:after="120" w:line="240" w:lineRule="auto"/>
-                        <w:jc w:val="both"/>
-                      </w:pPr>
-                      <w:r>
-                        <w:rPr>
-                          <w:color w:val="000000"/>
-                          <w:sz w:val="48"/>
-                          <w:szCs w:val="48"/>
-                        </w:rPr>
-                        <w:t>Escribe si cada instrucción es DDL, DML o DCL y cuál es su función.</w:t>
-                      </w:r>
-                    </w:p>
-                    <w:p>
-                      <w:pPr>
-                        <w:keepNext/>
-                        <w:spacing w:after="120" w:line="240" w:lineRule="auto"/>
-                      </w:pPr>
-                      <w:r>
-                        <w:rPr>
-                          <w:b/>
-                          <w:bCs/>
-                          <w:color w:val="000000"/>
-                          <w:sz w:val="48"/>
-                          <w:szCs w:val="48"/>
-                        </w:rPr>
-                        <w:t>Tabla de trabajo del ejercicio 1</w:t>
-                      </w:r>
-                    </w:p>
-                    <w:tbl>
-                      <w:tblPr>
-                        <w:tblW w:w="12400" w:type="dxa"/>
-                        <w:jc w:val="center"/>
-                        <w:tblBorders>
-                          <w:top w:val="single" w:sz="6" w:space="0" w:color="000000"/>
-                          <w:left w:val="single" w:sz="6" w:space="0" w:color="000000"/>
-                          <w:bottom w:val="single" w:sz="6" w:space="0" w:color="000000"/>
-                          <w:right w:val="single" w:sz="6" w:space="0" w:color="000000"/>
-                          <w:insideH w:val="single" w:sz="6" w:space="0" w:color="000000"/>
-                          <w:insideV w:val="single" w:sz="6" w:space="0" w:color="000000"/>
-                        </w:tblBorders>
-                        <w:tblLayout w:type="fixed"/>
-                        <w:tblLook w:val="04A0" w:firstRow="1" w:lastRow="0" w:firstColumn="1" w:lastColumn="0" w:noHBand="0" w:noVBand="1"/>
-                      </w:tblPr>
-                      <w:tblGrid>
-                        <w:gridCol w:w="4133"/>
-                        <w:gridCol w:w="8267"/>
-                      </w:tblGrid>
-                      <w:tr>
-                        <w:trPr>
-                          <w:cantSplit/>
-                          <w:tblHeader/>
-                          <w:jc w:val="center"/>
-                        </w:trPr>
-                        <w:tc>
-                          <w:tcPr>
-                            <w:tcW w:w="4133" w:type="dxa"/>
-                            <w:shd w:val="clear" w:color="auto" w:fill="E7E6E6"/>
-                            <w:vAlign w:val="center"/>
-                          </w:tcPr>
+            <w:t>[Cuadro de texto]</w:t>
+          </mc:Fallback>
+        </mc:AlternateContent>
+      </w:r>
+    </w:p>
+    <w:p>
+      <w:r>
+        <w:br w:type="page"/>
+      </w:r>
+    </w:p>
+    <w:p>
+      <w:pPr>
+        <w:spacing w:after="0" w:line="278" w:lineRule="auto"/>
+      </w:pPr>
+      <w:r>
+        <w:rPr>
+          <w:noProof/>
+        </w:rPr>
+        <w:lastRenderedPageBreak/>
+        <mc:AlternateContent>
+          <mc:Choice Requires="wps">
+            <w:drawing>
+              <wp:anchor distT="0" distB="0" distL="114300" distR="114300" simplePos="0" relativeHeight="251660501" behindDoc="0" locked="0" layoutInCell="1" allowOverlap="1" wp14:anchorId="6E8CF586" wp14:editId="30B404CD">
+                <wp:simplePos x="0" y="0"/>
+                <wp:positionH relativeFrom="margin">
+                  <wp:align>center</wp:align>
+                </wp:positionH>
+                <wp:positionV relativeFrom="paragraph">
+                  <wp:posOffset>0</wp:posOffset>
+                </wp:positionV>
+                <wp:extent cx="8280404" cy="5772150"/>
+                <wp:effectExtent l="0" t="0" r="0" b="0"/>
+                <wp:wrapNone/>
+                <wp:docPr id="1502" name="CuadroTexto 1502"/>
+                <wp:cNvGraphicFramePr/>
+                <a:graphic xmlns:a="http://schemas.openxmlformats.org/drawingml/2006/main">
+                  <a:graphicData uri="http://schemas.microsoft.com/office/word/2010/wordprocessingShape">
+                    <wps:wsp>
+                      <wps:cNvSpPr txBox="1"/>
+                      <wps:spPr>
+                        <a:xfrm>
+                          <a:off x="0" y="0"/>
+                          <a:ext cx="8280404" cy="5772150"/>
+                        </a:xfrm>
+                        <a:prstGeom prst="rect">
+                          <a:avLst/>
+                        </a:prstGeom>
+                        <a:noFill/>
+                        <a:ln>
+                          <a:noFill/>
+                        </a:ln>
+                      </wps:spPr>
+                      <wps:txbx>
+                        <w:txbxContent>
                           <w:p>
                             <w:pPr>
-                              <w:spacing w:after="0" w:line="240" w:lineRule="auto"/>
+                              <w:keepNext/>
+                              <w:spacing w:after="120" w:line="240" w:lineRule="auto"/>
                             </w:pPr>
                             <w:r>
                               <w:rPr>
@@ -821,303 +714,209 @@
                                 <w:sz w:val="48"/>
                                 <w:szCs w:val="48"/>
                               </w:rPr>
-                              <w:t>Instrucción</w:t>
+                              <w:t>Tabla de trabajo del ejercicio 1 (continuación)</w:t>
                             </w:r>
                           </w:p>
-                        </w:tc>
-                        <w:tc>
-                          <w:tcPr>
-                            <w:tcW w:w="8267" w:type="dxa"/>
-                            <w:shd w:val="clear" w:color="auto" w:fill="E7E6E6"/>
-                            <w:vAlign w:val="center"/>
-                          </w:tcPr>
-                          <w:p>
-                            <w:pPr>
-                              <w:spacing w:after="0" w:line="240" w:lineRule="auto"/>
-                            </w:pPr>
-                            <w:r>
-                              <w:rPr>
-                                <w:b/>
-                                <w:bCs/>
-                                <w:color w:val="000000"/>
-                                <w:sz w:val="48"/>
-                                <w:szCs w:val="48"/>
-                              </w:rPr>
-                              <w:t>Lenguaje y función</w:t>
-                            </w:r>
-                          </w:p>
-                        </w:tc>
-                      </w:tr>
-                      <w:tr>
-                        <w:trPr>
-                          <w:cantSplit/>
-                          <w:jc w:val="center"/>
-                        </w:trPr>
-                        <w:tc>
-                          <w:tcPr>
-                            <w:tcW w:w="4133" w:type="dxa"/>
-                            <w:vAlign w:val="center"/>
-                          </w:tcPr>
-                          <w:p>
-                            <w:pPr>
-                              <w:spacing w:after="0" w:line="240" w:lineRule="auto"/>
-                            </w:pPr>
-                            <w:r>
-                              <w:rPr>
-                                <w:rFonts w:ascii="Consolas" w:hAnsi="Consolas" w:cs="Consolas"/>
-                                <w:color w:val="000000"/>
-                                <w:sz w:val="48"/>
-                                <w:szCs w:val="48"/>
-                              </w:rPr>
-                              <w:t>CREATE</w:t>
-                            </w:r>
-                          </w:p>
-                        </w:tc>
-                        <w:tc>
-                          <w:tcPr>
-                            <w:tcW w:w="8267" w:type="dxa"/>
-                            <w:vAlign w:val="center"/>
-                          </w:tcPr>
+                          <w:tbl>
+                            <w:tblPr>
+                              <w:tblW w:w="12400" w:type="dxa"/>
+                              <w:jc w:val="center"/>
+                              <w:tblBorders>
+                                <w:top w:val="single" w:sz="6" w:space="0" w:color="000000"/>
+                                <w:left w:val="single" w:sz="6" w:space="0" w:color="000000"/>
+                                <w:bottom w:val="single" w:sz="6" w:space="0" w:color="000000"/>
+                                <w:right w:val="single" w:sz="6" w:space="0" w:color="000000"/>
+                                <w:insideH w:val="single" w:sz="6" w:space="0" w:color="000000"/>
+                                <w:insideV w:val="single" w:sz="6" w:space="0" w:color="000000"/>
+                              </w:tblBorders>
+                              <w:tblLayout w:type="fixed"/>
+                              <w:tblLook w:val="04A0" w:firstRow="1" w:lastRow="0" w:firstColumn="1" w:lastColumn="0" w:noHBand="0" w:noVBand="1"/>
+                            </w:tblPr>
+                            <w:tblGrid>
+                              <w:gridCol w:w="4133"/>
+                              <w:gridCol w:w="8267"/>
+                            </w:tblGrid>
+                            <w:tr>
+                              <w:trPr>
+                                <w:cantSplit/>
+                                <w:tblHeader/>
+                                <w:jc w:val="center"/>
+                              </w:trPr>
+                              <w:tc>
+                                <w:tcPr>
+                                  <w:tcW w:w="4133" w:type="dxa"/>
+                                  <w:shd w:val="clear" w:color="auto" w:fill="E7E6E6"/>
+                                  <w:vAlign w:val="center"/>
+                                </w:tcPr>
+                                <w:p>
+                                  <w:pPr>
+                                    <w:spacing w:after="0" w:line="240" w:lineRule="auto"/>
+                                  </w:pPr>
+                                  <w:r>
+                                    <w:rPr>
+                                      <w:b/>
+                                      <w:bCs/>
+                                      <w:color w:val="000000"/>
+                                      <w:sz w:val="48"/>
+                                      <w:szCs w:val="48"/>
+                                    </w:rPr>
+                                    <w:t>Instrucción</w:t>
+                                  </w:r>
+                                </w:p>
+                              </w:tc>
+                              <w:tc>
+                                <w:tcPr>
+                                  <w:tcW w:w="8267" w:type="dxa"/>
+                                  <w:shd w:val="clear" w:color="auto" w:fill="E7E6E6"/>
+                                  <w:vAlign w:val="center"/>
+                                </w:tcPr>
+                                <w:p>
+                                  <w:pPr>
+                                    <w:spacing w:after="0" w:line="240" w:lineRule="auto"/>
+                                  </w:pPr>
+                                  <w:r>
+                                    <w:rPr>
+                                      <w:b/>
+                                      <w:bCs/>
+                                      <w:color w:val="000000"/>
+                                      <w:sz w:val="48"/>
+                                      <w:szCs w:val="48"/>
+                                    </w:rPr>
+                                    <w:t>Lenguaje y función</w:t>
+                                  </w:r>
+                                </w:p>
+                              </w:tc>
+                            </w:tr>
+                            <w:tr>
+                              <w:trPr>
+                                <w:cantSplit/>
+                                <w:jc w:val="center"/>
+                              </w:trPr>
+                              <w:tc>
+                                <w:tcPr>
+                                  <w:tcW w:w="4133" w:type="dxa"/>
+                                  <w:vAlign w:val="center"/>
+                                </w:tcPr>
+                                <w:p>
+                                  <w:pPr>
+                                    <w:spacing w:after="0" w:line="240" w:lineRule="auto"/>
+                                  </w:pPr>
+                                  <w:r>
+                                    <w:rPr>
+                                      <w:rFonts w:ascii="Consolas" w:hAnsi="Consolas" w:cs="Consolas"/>
+                                      <w:color w:val="000000"/>
+                                      <w:sz w:val="48"/>
+                                      <w:szCs w:val="48"/>
+                                    </w:rPr>
+                                    <w:t>INSERT</w:t>
+                                  </w:r>
+                                </w:p>
+                              </w:tc>
+                              <w:tc>
+                                <w:tcPr>
+                                  <w:tcW w:w="8267" w:type="dxa"/>
+                                  <w:vAlign w:val="center"/>
+                                </w:tcPr>
+                                <w:p>
+                                  <w:pPr>
+                                    <w:spacing w:after="0" w:line="240" w:lineRule="auto"/>
+                                  </w:pPr>
+                                </w:p>
+                              </w:tc>
+                            </w:tr>
+                            <w:tr>
+                              <w:trPr>
+                                <w:cantSplit/>
+                                <w:jc w:val="center"/>
+                              </w:trPr>
+                              <w:tc>
+                                <w:tcPr>
+                                  <w:tcW w:w="4133" w:type="dxa"/>
+                                  <w:vAlign w:val="center"/>
+                                </w:tcPr>
+                                <w:p>
+                                  <w:pPr>
+                                    <w:spacing w:after="0" w:line="240" w:lineRule="auto"/>
+                                  </w:pPr>
+                                  <w:r>
+                                    <w:rPr>
+                                      <w:rFonts w:ascii="Consolas" w:hAnsi="Consolas" w:cs="Consolas"/>
+                                      <w:color w:val="000000"/>
+                                      <w:sz w:val="48"/>
+                                      <w:szCs w:val="48"/>
+                                    </w:rPr>
+                                    <w:t>DROP TABLE</w:t>
+                                  </w:r>
+                                </w:p>
+                              </w:tc>
+                              <w:tc>
+                                <w:tcPr>
+                                  <w:tcW w:w="8267" w:type="dxa"/>
+                                  <w:vAlign w:val="center"/>
+                                </w:tcPr>
+                                <w:p>
+                                  <w:pPr>
+                                    <w:spacing w:after="0" w:line="240" w:lineRule="auto"/>
+                                  </w:pPr>
+                                </w:p>
+                              </w:tc>
+                            </w:tr>
+                            <w:tr>
+                              <w:trPr>
+                                <w:cantSplit/>
+                                <w:jc w:val="center"/>
+                              </w:trPr>
+                              <w:tc>
+                                <w:tcPr>
+                                  <w:tcW w:w="4133" w:type="dxa"/>
+                                  <w:vAlign w:val="center"/>
+                                </w:tcPr>
+                                <w:p>
+                                  <w:pPr>
+                                    <w:spacing w:after="0" w:line="240" w:lineRule="auto"/>
+                                  </w:pPr>
+                                  <w:r>
+                                    <w:rPr>
+                                      <w:rFonts w:ascii="Consolas" w:hAnsi="Consolas" w:cs="Consolas"/>
+                                      <w:color w:val="000000"/>
+                                      <w:sz w:val="48"/>
+                                      <w:szCs w:val="48"/>
+                                    </w:rPr>
+                                    <w:t>CREATE VIEW</w:t>
+                                  </w:r>
+                                </w:p>
+                              </w:tc>
+                              <w:tc>
+                                <w:tcPr>
+                                  <w:tcW w:w="8267" w:type="dxa"/>
+                                  <w:vAlign w:val="center"/>
+                                </w:tcPr>
+                                <w:p>
+                                  <w:pPr>
+                                    <w:spacing w:after="0" w:line="240" w:lineRule="auto"/>
+                                  </w:pPr>
+                                </w:p>
+                              </w:tc>
+                            </w:tr>
+                          </w:tbl>
                           <w:p>
                             <w:pPr>
                               <w:spacing w:after="0" w:line="240" w:lineRule="auto"/>
                             </w:pPr>
                           </w:p>
-                        </w:tc>
-                      </w:tr>
-                      <w:tr>
-                        <w:trPr>
-                          <w:cantSplit/>
-                          <w:jc w:val="center"/>
-                        </w:trPr>
-                        <w:tc>
-                          <w:tcPr>
-                            <w:tcW w:w="4133" w:type="dxa"/>
-                            <w:vAlign w:val="center"/>
-                          </w:tcPr>
-                          <w:p>
-                            <w:pPr>
-                              <w:spacing w:after="0" w:line="240" w:lineRule="auto"/>
-                            </w:pPr>
-                            <w:r>
-                              <w:rPr>
-                                <w:rFonts w:ascii="Consolas" w:hAnsi="Consolas" w:cs="Consolas"/>
-                                <w:color w:val="000000"/>
-                                <w:sz w:val="48"/>
-                                <w:szCs w:val="48"/>
-                              </w:rPr>
-                              <w:t>SELECT</w:t>
-                            </w:r>
-                          </w:p>
-                        </w:tc>
-                        <w:tc>
-                          <w:tcPr>
-                            <w:tcW w:w="8267" w:type="dxa"/>
-                            <w:vAlign w:val="center"/>
-                          </w:tcPr>
-                          <w:p>
-                            <w:pPr>
-                              <w:spacing w:after="0" w:line="240" w:lineRule="auto"/>
-                            </w:pPr>
-                          </w:p>
-                        </w:tc>
-                      </w:tr>
-                      <w:tr>
-                        <w:trPr>
-                          <w:cantSplit/>
-                          <w:jc w:val="center"/>
-                        </w:trPr>
-                        <w:tc>
-                          <w:tcPr>
-                            <w:tcW w:w="4133" w:type="dxa"/>
-                            <w:vAlign w:val="center"/>
-                          </w:tcPr>
-                          <w:p>
-                            <w:pPr>
-                              <w:spacing w:after="0" w:line="240" w:lineRule="auto"/>
-                            </w:pPr>
-                            <w:r>
-                              <w:rPr>
-                                <w:rFonts w:ascii="Consolas" w:hAnsi="Consolas" w:cs="Consolas"/>
-                                <w:color w:val="000000"/>
-                                <w:sz w:val="48"/>
-                                <w:szCs w:val="48"/>
-                              </w:rPr>
-                              <w:t>GRANT</w:t>
-                            </w:r>
-                          </w:p>
-                        </w:tc>
-                        <w:tc>
-                          <w:tcPr>
-                            <w:tcW w:w="8267" w:type="dxa"/>
-                            <w:vAlign w:val="center"/>
-                          </w:tcPr>
-                          <w:p>
-                            <w:pPr>
-                              <w:spacing w:after="0" w:line="240" w:lineRule="auto"/>
-                            </w:pPr>
-                          </w:p>
-                        </w:tc>
-                      </w:tr>
-                      <w:tr>
-                        <w:trPr>
-                          <w:cantSplit/>
-                          <w:jc w:val="center"/>
-                        </w:trPr>
-                        <w:tc>
-                          <w:tcPr>
-                            <w:tcW w:w="4133" w:type="dxa"/>
-                            <w:vAlign w:val="center"/>
-                          </w:tcPr>
-                          <w:p>
-                            <w:pPr>
-                              <w:spacing w:after="0" w:line="240" w:lineRule="auto"/>
-                            </w:pPr>
-                            <w:r>
-                              <w:rPr>
-                                <w:rFonts w:ascii="Consolas" w:hAnsi="Consolas" w:cs="Consolas"/>
-                                <w:color w:val="000000"/>
-                                <w:sz w:val="48"/>
-                                <w:szCs w:val="48"/>
-                              </w:rPr>
-                              <w:t>ALTER</w:t>
-                            </w:r>
-                          </w:p>
-                        </w:tc>
-                        <w:tc>
-                          <w:tcPr>
-                            <w:tcW w:w="8267" w:type="dxa"/>
-                            <w:vAlign w:val="center"/>
-                          </w:tcPr>
-                          <w:p>
-                            <w:pPr>
-                              <w:spacing w:after="0" w:line="240" w:lineRule="auto"/>
-                            </w:pPr>
-                          </w:p>
-                        </w:tc>
-                      </w:tr>
-                      <w:tr>
-                        <w:trPr>
-                          <w:cantSplit/>
-                          <w:jc w:val="center"/>
-                        </w:trPr>
-                        <w:tc>
-                          <w:tcPr>
-                            <w:tcW w:w="4133" w:type="dxa"/>
-                            <w:vAlign w:val="center"/>
-                          </w:tcPr>
-                          <w:p>
-                            <w:pPr>
-                              <w:spacing w:after="0" w:line="240" w:lineRule="auto"/>
-                            </w:pPr>
-                            <w:r>
-                              <w:rPr>
-                                <w:rFonts w:ascii="Consolas" w:hAnsi="Consolas" w:cs="Consolas"/>
-                                <w:color w:val="000000"/>
-                                <w:sz w:val="48"/>
-                                <w:szCs w:val="48"/>
-                              </w:rPr>
-                              <w:t>DELETE</w:t>
-                            </w:r>
-                          </w:p>
-                        </w:tc>
-                        <w:tc>
-                          <w:tcPr>
-                            <w:tcW w:w="8267" w:type="dxa"/>
-                            <w:vAlign w:val="center"/>
-                          </w:tcPr>
-                          <w:p>
-                            <w:pPr>
-                              <w:spacing w:after="0" w:line="240" w:lineRule="auto"/>
-                            </w:pPr>
-                          </w:p>
-                        </w:tc>
-                      </w:tr>
-                      <w:tr>
-                        <w:trPr>
-                          <w:cantSplit/>
-                          <w:jc w:val="center"/>
-                        </w:trPr>
-                        <w:tc>
-                          <w:tcPr>
-                            <w:tcW w:w="4133" w:type="dxa"/>
-                            <w:vAlign w:val="center"/>
-                          </w:tcPr>
-                          <w:p>
-                            <w:pPr>
-                              <w:spacing w:after="0" w:line="240" w:lineRule="auto"/>
-                            </w:pPr>
-                            <w:r>
-                              <w:rPr>
-                                <w:rFonts w:ascii="Consolas" w:hAnsi="Consolas" w:cs="Consolas"/>
-                                <w:color w:val="000000"/>
-                                <w:sz w:val="48"/>
-                                <w:szCs w:val="48"/>
-                              </w:rPr>
-                              <w:t>REVOKE</w:t>
-                            </w:r>
-                          </w:p>
-                        </w:tc>
-                        <w:tc>
-                          <w:tcPr>
-                            <w:tcW w:w="8267" w:type="dxa"/>
-                            <w:vAlign w:val="center"/>
-                          </w:tcPr>
-                          <w:p>
-                            <w:pPr>
-                              <w:spacing w:after="0" w:line="240" w:lineRule="auto"/>
-                            </w:pPr>
-                          </w:p>
-                        </w:tc>
-                      </w:tr>
-                      <w:tr>
-                        <w:trPr>
-                          <w:cantSplit/>
-                          <w:jc w:val="center"/>
-                        </w:trPr>
-                        <w:tc>
-                          <w:tcPr>
-                            <w:tcW w:w="4133" w:type="dxa"/>
-                            <w:vAlign w:val="center"/>
-                          </w:tcPr>
-                          <w:p>
-                            <w:pPr>
-                              <w:spacing w:after="0" w:line="240" w:lineRule="auto"/>
-                            </w:pPr>
-                            <w:r>
-                              <w:rPr>
-                                <w:rFonts w:ascii="Consolas" w:hAnsi="Consolas" w:cs="Consolas"/>
-                                <w:color w:val="000000"/>
-                                <w:sz w:val="48"/>
-                                <w:szCs w:val="48"/>
-                              </w:rPr>
-                              <w:t>UPDATE</w:t>
-                            </w:r>
-                          </w:p>
-                        </w:tc>
-                        <w:tc>
-                          <w:tcPr>
-                            <w:tcW w:w="8267" w:type="dxa"/>
-                            <w:vAlign w:val="center"/>
-                          </w:tcPr>
-                          <w:p>
-                            <w:pPr>
-                              <w:spacing w:after="0" w:line="240" w:lineRule="auto"/>
-                            </w:pPr>
-                          </w:p>
-                        </w:tc>
-                      </w:tr>
-                    </w:tbl>
-                    <w:p>
-                      <w:pPr>
-                        <w:spacing w:after="0" w:line="240" w:lineRule="auto"/>
-                      </w:pPr>
-                    </w:p>
-                  </w:txbxContent>
-                </v:textbox>
-                <w10:wrap anchorx="margin"/>
-              </v:shape>
-            </w:pict>
+                        </w:txbxContent>
+                      </wps:txbx>
+                      <wps:bodyPr vert="horz" wrap="square" lIns="91440" tIns="45720" rIns="91440" bIns="45720" anchor="t" anchorCtr="0" compatLnSpc="0">
+                        <a:spAutoFit/>
+                      </wps:bodyPr>
+                    </wps:wsp>
+                  </a:graphicData>
+                </a:graphic>
+              </wp:anchor>
+            </w:drawing>
+          </mc:Choice>
+          <mc:Fallback>
+            <w:t>[Cuadro de texto]</w:t>
           </mc:Fallback>
         </mc:AlternateContent>
       </w:r>
@@ -1294,7 +1093,7 @@
                                       <w:sz w:val="48"/>
                                       <w:szCs w:val="48"/>
                                     </w:rPr>
-                                    <w:t>CREATE</w:t>
+                                    <w:t>CREATE TABLE</w:t>
                                   </w:r>
                                 </w:p>
                               </w:tc>
@@ -1429,7 +1228,7 @@
                                       <w:sz w:val="48"/>
                                       <w:szCs w:val="48"/>
                                     </w:rPr>
-                                    <w:t>ALTER</w:t>
+                                    <w:t>ALTER TABLE</w:t>
                                   </w:r>
                                 </w:p>
                               </w:tc>
@@ -1584,6 +1383,186 @@
                                       <w:szCs w:val="48"/>
                                     </w:rPr>
                                     <w:t>DML, manipulación</w:t>
+                                  </w:r>
+                                </w:p>
+                              </w:tc>
+                            </w:tr>
+                            <w:tr>
+                              <w:trPr>
+                                <w:cantSplit/>
+                                <w:jc w:val="center"/>
+                              </w:trPr>
+                              <w:tc>
+                                <w:tcPr>
+                                  <w:tcW w:w="4133" w:type="dxa"/>
+                                  <w:vAlign w:val="center"/>
+                                </w:tcPr>
+                                <w:p>
+                                  <w:pPr>
+                                    <w:spacing w:after="0" w:line="240" w:lineRule="auto"/>
+                                  </w:pPr>
+                                  <w:r>
+                                    <w:rPr>
+                                      <w:rFonts w:ascii="Consolas" w:hAnsi="Consolas" w:cs="Consolas"/>
+                                      <w:color w:val="000000"/>
+                                      <w:sz w:val="48"/>
+                                      <w:szCs w:val="48"/>
+                                    </w:rPr>
+                                    <w:t>CREATE INDEX</w:t>
+                                  </w:r>
+                                </w:p>
+                              </w:tc>
+                              <w:tc>
+                                <w:tcPr>
+                                  <w:tcW w:w="8267" w:type="dxa"/>
+                                  <w:vAlign w:val="center"/>
+                                </w:tcPr>
+                                <w:p>
+                                  <w:pPr>
+                                    <w:spacing w:after="0" w:line="240" w:lineRule="auto"/>
+                                  </w:pPr>
+                                  <w:r>
+                                    <w:rPr>
+                                      <w:color w:val="000000"/>
+                                      <w:sz w:val="48"/>
+                                      <w:szCs w:val="48"/>
+                                    </w:rPr>
+                                    <w:t>DDL, definición</w:t>
+                                  </w:r>
+                                </w:p>
+                              </w:tc>
+                            </w:tr>
+                            <w:tr>
+                              <w:trPr>
+                                <w:cantSplit/>
+                                <w:jc w:val="center"/>
+                              </w:trPr>
+                              <w:tc>
+                                <w:tcPr>
+                                  <w:tcW w:w="4133" w:type="dxa"/>
+                                  <w:vAlign w:val="center"/>
+                                </w:tcPr>
+                                <w:p>
+                                  <w:pPr>
+                                    <w:spacing w:after="0" w:line="240" w:lineRule="auto"/>
+                                  </w:pPr>
+                                  <w:r>
+                                    <w:rPr>
+                                      <w:rFonts w:ascii="Consolas" w:hAnsi="Consolas" w:cs="Consolas"/>
+                                      <w:color w:val="000000"/>
+                                      <w:sz w:val="48"/>
+                                      <w:szCs w:val="48"/>
+                                    </w:rPr>
+                                    <w:t>INSERT</w:t>
+                                  </w:r>
+                                </w:p>
+                              </w:tc>
+                              <w:tc>
+                                <w:tcPr>
+                                  <w:tcW w:w="8267" w:type="dxa"/>
+                                  <w:vAlign w:val="center"/>
+                                </w:tcPr>
+                                <w:p>
+                                  <w:pPr>
+                                    <w:spacing w:after="0" w:line="240" w:lineRule="auto"/>
+                                  </w:pPr>
+                                  <w:r>
+                                    <w:rPr>
+                                      <w:color w:val="000000"/>
+                                      <w:sz w:val="48"/>
+                                      <w:szCs w:val="48"/>
+                                    </w:rPr>
+                                    <w:t>DML, manipulación</w:t>
+                                  </w:r>
+                                </w:p>
+                              </w:tc>
+                            </w:tr>
+                            <w:tr>
+                              <w:trPr>
+                                <w:cantSplit/>
+                                <w:jc w:val="center"/>
+                              </w:trPr>
+                              <w:tc>
+                                <w:tcPr>
+                                  <w:tcW w:w="4133" w:type="dxa"/>
+                                  <w:vAlign w:val="center"/>
+                                </w:tcPr>
+                                <w:p>
+                                  <w:pPr>
+                                    <w:spacing w:after="0" w:line="240" w:lineRule="auto"/>
+                                  </w:pPr>
+                                  <w:r>
+                                    <w:rPr>
+                                      <w:rFonts w:ascii="Consolas" w:hAnsi="Consolas" w:cs="Consolas"/>
+                                      <w:color w:val="000000"/>
+                                      <w:sz w:val="48"/>
+                                      <w:szCs w:val="48"/>
+                                    </w:rPr>
+                                    <w:t>DROP TABLE</w:t>
+                                  </w:r>
+                                </w:p>
+                              </w:tc>
+                              <w:tc>
+                                <w:tcPr>
+                                  <w:tcW w:w="8267" w:type="dxa"/>
+                                  <w:vAlign w:val="center"/>
+                                </w:tcPr>
+                                <w:p>
+                                  <w:pPr>
+                                    <w:spacing w:after="0" w:line="240" w:lineRule="auto"/>
+                                  </w:pPr>
+                                  <w:r>
+                                    <w:rPr>
+                                      <w:color w:val="000000"/>
+                                      <w:sz w:val="48"/>
+                                      <w:szCs w:val="48"/>
+                                    </w:rPr>
+                                    <w:t>DDL, definición</w:t>
+                                  </w:r>
+                                </w:p>
+                              </w:tc>
+                            </w:tr>
+                            <w:tr>
+                              <w:trPr>
+                                <w:cantSplit/>
+                                <w:jc w:val="center"/>
+                              </w:trPr>
+                              <w:tc>
+                                <w:tcPr>
+                                  <w:tcW w:w="4133" w:type="dxa"/>
+                                  <w:vAlign w:val="center"/>
+                                </w:tcPr>
+                                <w:p>
+                                  <w:pPr>
+                                    <w:spacing w:after="0" w:line="240" w:lineRule="auto"/>
+                                  </w:pPr>
+                                  <w:r>
+                                    <w:rPr>
+                                      <w:rFonts w:ascii="Consolas" w:hAnsi="Consolas" w:cs="Consolas"/>
+                                      <w:color w:val="000000"/>
+                                      <w:sz w:val="48"/>
+                                      <w:szCs w:val="48"/>
+                                    </w:rPr>
+                                    <w:t>CREATE VIEW</w:t>
+                                  </w:r>
+                                </w:p>
+                              </w:tc>
+                              <w:tc>
+                                <w:tcPr>
+                                  <w:tcW w:w="8267" w:type="dxa"/>
+                                  <w:vAlign w:val="center"/>
+                                </w:tcPr>
+                                <w:p>
+                                  <w:pPr>
+                                    <w:spacing w:after="0" w:line="240" w:lineRule="auto"/>
+                                  </w:pPr>
+                                  <w:r>
+                                    <w:rPr>
+                                      <w:color w:val="000000"/>
+                                      <w:sz w:val="48"/>
+                                      <w:szCs w:val="48"/>
+                                    </w:rPr>
+                                    <w:t>DDL, definición</w:t>
                                   </w:r>
                                 </w:p>
                               </w:tc>
@@ -1606,438 +1585,7 @@
             </w:drawing>
           </mc:Choice>
           <mc:Fallback>
-            <w:pict>
-              <v:shape w14:anchorId="0528EE57" id="CuadroTexto 1003" o:spid="_x0000_s1028" type="#_x0000_t202" style="position:absolute;margin-left:0;margin-top:0;width:652pt;height:454.5pt;z-index:251660002;visibility:visible;mso-wrap-style:square;mso-wrap-distance-left:9pt;mso-wrap-distance-top:0;mso-wrap-distance-right:9pt;mso-wrap-distance-bottom:0;mso-position-horizontal:center;mso-position-horizontal-relative:margin;mso-position-vertical:absolute;mso-position-vertical-relative:text;v-text-anchor:top" o:gfxdata="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" filled="f" stroked="f">
-                <v:textbox style="mso-fit-shape-to-text:t">
-                  <w:txbxContent>
-                    <w:p>
-                      <w:pPr>
-                        <w:keepNext/>
-                        <w:spacing w:after="120" w:line="240" w:lineRule="auto"/>
-                      </w:pPr>
-                      <w:r>
-                        <w:rPr>
-                          <w:b/>
-                          <w:bCs/>
-                          <w:color w:val="000000"/>
-                          <w:sz w:val="48"/>
-                          <w:szCs w:val="48"/>
-                        </w:rPr>
-                        <w:t>Solución del ejercicio 1</w:t>
-                      </w:r>
-                    </w:p>
-                    <w:p>
-                      <w:pPr>
-                        <w:keepNext/>
-                        <w:spacing w:after="120" w:line="240" w:lineRule="auto"/>
-                      </w:pPr>
-                      <w:r>
-                        <w:rPr>
-                          <w:b/>
-                          <w:bCs/>
-                          <w:color w:val="000000"/>
-                          <w:sz w:val="48"/>
-                          <w:szCs w:val="48"/>
-                        </w:rPr>
-                        <w:t>Tabla de solución del ejercicio 1</w:t>
-                      </w:r>
-                    </w:p>
-                    <w:tbl>
-                      <w:tblPr>
-                        <w:tblW w:w="12400" w:type="dxa"/>
-                        <w:jc w:val="center"/>
-                        <w:tblBorders>
-                          <w:top w:val="single" w:sz="6" w:space="0" w:color="000000"/>
-                          <w:left w:val="single" w:sz="6" w:space="0" w:color="000000"/>
-                          <w:bottom w:val="single" w:sz="6" w:space="0" w:color="000000"/>
-                          <w:right w:val="single" w:sz="6" w:space="0" w:color="000000"/>
-                          <w:insideH w:val="single" w:sz="6" w:space="0" w:color="000000"/>
-                          <w:insideV w:val="single" w:sz="6" w:space="0" w:color="000000"/>
-                        </w:tblBorders>
-                        <w:tblLayout w:type="fixed"/>
-                        <w:tblLook w:val="04A0" w:firstRow="1" w:lastRow="0" w:firstColumn="1" w:lastColumn="0" w:noHBand="0" w:noVBand="1"/>
-                      </w:tblPr>
-                      <w:tblGrid>
-                        <w:gridCol w:w="4133"/>
-                        <w:gridCol w:w="8267"/>
-                      </w:tblGrid>
-                      <w:tr>
-                        <w:trPr>
-                          <w:cantSplit/>
-                          <w:tblHeader/>
-                          <w:jc w:val="center"/>
-                        </w:trPr>
-                        <w:tc>
-                          <w:tcPr>
-                            <w:tcW w:w="4133" w:type="dxa"/>
-                            <w:shd w:val="clear" w:color="auto" w:fill="E7E6E6"/>
-                            <w:vAlign w:val="center"/>
-                          </w:tcPr>
-                          <w:p>
-                            <w:pPr>
-                              <w:spacing w:after="0" w:line="240" w:lineRule="auto"/>
-                            </w:pPr>
-                            <w:r>
-                              <w:rPr>
-                                <w:b/>
-                                <w:bCs/>
-                                <w:color w:val="000000"/>
-                                <w:sz w:val="48"/>
-                                <w:szCs w:val="48"/>
-                              </w:rPr>
-                              <w:t>Instrucción</w:t>
-                            </w:r>
-                          </w:p>
-                        </w:tc>
-                        <w:tc>
-                          <w:tcPr>
-                            <w:tcW w:w="8267" w:type="dxa"/>
-                            <w:shd w:val="clear" w:color="auto" w:fill="E7E6E6"/>
-                            <w:vAlign w:val="center"/>
-                          </w:tcPr>
-                          <w:p>
-                            <w:pPr>
-                              <w:spacing w:after="0" w:line="240" w:lineRule="auto"/>
-                            </w:pPr>
-                            <w:r>
-                              <w:rPr>
-                                <w:b/>
-                                <w:bCs/>
-                                <w:color w:val="000000"/>
-                                <w:sz w:val="48"/>
-                                <w:szCs w:val="48"/>
-                              </w:rPr>
-                              <w:t>Lenguaje y función</w:t>
-                            </w:r>
-                          </w:p>
-                        </w:tc>
-                      </w:tr>
-                      <w:tr>
-                        <w:trPr>
-                          <w:cantSplit/>
-                          <w:jc w:val="center"/>
-                        </w:trPr>
-                        <w:tc>
-                          <w:tcPr>
-                            <w:tcW w:w="4133" w:type="dxa"/>
-                            <w:vAlign w:val="center"/>
-                          </w:tcPr>
-                          <w:p>
-                            <w:pPr>
-                              <w:spacing w:after="0" w:line="240" w:lineRule="auto"/>
-                            </w:pPr>
-                            <w:r>
-                              <w:rPr>
-                                <w:rFonts w:ascii="Consolas" w:hAnsi="Consolas" w:cs="Consolas"/>
-                                <w:color w:val="000000"/>
-                                <w:sz w:val="48"/>
-                                <w:szCs w:val="48"/>
-                              </w:rPr>
-                              <w:t>CREATE</w:t>
-                            </w:r>
-                          </w:p>
-                        </w:tc>
-                        <w:tc>
-                          <w:tcPr>
-                            <w:tcW w:w="8267" w:type="dxa"/>
-                            <w:vAlign w:val="center"/>
-                          </w:tcPr>
-                          <w:p>
-                            <w:pPr>
-                              <w:spacing w:after="0" w:line="240" w:lineRule="auto"/>
-                            </w:pPr>
-                            <w:r>
-                              <w:rPr>
-                                <w:color w:val="000000"/>
-                                <w:sz w:val="48"/>
-                                <w:szCs w:val="48"/>
-                              </w:rPr>
-                              <w:t>DDL, definición</w:t>
-                            </w:r>
-                          </w:p>
-                        </w:tc>
-                      </w:tr>
-                      <w:tr>
-                        <w:trPr>
-                          <w:cantSplit/>
-                          <w:jc w:val="center"/>
-                        </w:trPr>
-                        <w:tc>
-                          <w:tcPr>
-                            <w:tcW w:w="4133" w:type="dxa"/>
-                            <w:vAlign w:val="center"/>
-                          </w:tcPr>
-                          <w:p>
-                            <w:pPr>
-                              <w:spacing w:after="0" w:line="240" w:lineRule="auto"/>
-                            </w:pPr>
-                            <w:r>
-                              <w:rPr>
-                                <w:rFonts w:ascii="Consolas" w:hAnsi="Consolas" w:cs="Consolas"/>
-                                <w:color w:val="000000"/>
-                                <w:sz w:val="48"/>
-                                <w:szCs w:val="48"/>
-                              </w:rPr>
-                              <w:t>SELECT</w:t>
-                            </w:r>
-                          </w:p>
-                        </w:tc>
-                        <w:tc>
-                          <w:tcPr>
-                            <w:tcW w:w="8267" w:type="dxa"/>
-                            <w:vAlign w:val="center"/>
-                          </w:tcPr>
-                          <w:p>
-                            <w:pPr>
-                              <w:spacing w:after="0" w:line="240" w:lineRule="auto"/>
-                            </w:pPr>
-                            <w:r>
-                              <w:rPr>
-                                <w:color w:val="000000"/>
-                                <w:sz w:val="48"/>
-                                <w:szCs w:val="48"/>
-                              </w:rPr>
-                              <w:t>DML, manipulación</w:t>
-                            </w:r>
-                          </w:p>
-                        </w:tc>
-                      </w:tr>
-                      <w:tr>
-                        <w:trPr>
-                          <w:cantSplit/>
-                          <w:jc w:val="center"/>
-                        </w:trPr>
-                        <w:tc>
-                          <w:tcPr>
-                            <w:tcW w:w="4133" w:type="dxa"/>
-                            <w:vAlign w:val="center"/>
-                          </w:tcPr>
-                          <w:p>
-                            <w:pPr>
-                              <w:spacing w:after="0" w:line="240" w:lineRule="auto"/>
-                            </w:pPr>
-                            <w:r>
-                              <w:rPr>
-                                <w:rFonts w:ascii="Consolas" w:hAnsi="Consolas" w:cs="Consolas"/>
-                                <w:color w:val="000000"/>
-                                <w:sz w:val="48"/>
-                                <w:szCs w:val="48"/>
-                              </w:rPr>
-                              <w:t>GRANT</w:t>
-                            </w:r>
-                          </w:p>
-                        </w:tc>
-                        <w:tc>
-                          <w:tcPr>
-                            <w:tcW w:w="8267" w:type="dxa"/>
-                            <w:vAlign w:val="center"/>
-                          </w:tcPr>
-                          <w:p>
-                            <w:pPr>
-                              <w:spacing w:after="0" w:line="240" w:lineRule="auto"/>
-                            </w:pPr>
-                            <w:r>
-                              <w:rPr>
-                                <w:color w:val="000000"/>
-                                <w:sz w:val="48"/>
-                                <w:szCs w:val="48"/>
-                              </w:rPr>
-                              <w:t>DCL, control</w:t>
-                            </w:r>
-                          </w:p>
-                        </w:tc>
-                      </w:tr>
-                      <w:tr>
-                        <w:trPr>
-                          <w:cantSplit/>
-                          <w:jc w:val="center"/>
-                        </w:trPr>
-                        <w:tc>
-                          <w:tcPr>
-                            <w:tcW w:w="4133" w:type="dxa"/>
-                            <w:vAlign w:val="center"/>
-                          </w:tcPr>
-                          <w:p>
-                            <w:pPr>
-                              <w:spacing w:after="0" w:line="240" w:lineRule="auto"/>
-                            </w:pPr>
-                            <w:r>
-                              <w:rPr>
-                                <w:rFonts w:ascii="Consolas" w:hAnsi="Consolas" w:cs="Consolas"/>
-                                <w:color w:val="000000"/>
-                                <w:sz w:val="48"/>
-                                <w:szCs w:val="48"/>
-                              </w:rPr>
-                              <w:t>ALTER</w:t>
-                            </w:r>
-                          </w:p>
-                        </w:tc>
-                        <w:tc>
-                          <w:tcPr>
-                            <w:tcW w:w="8267" w:type="dxa"/>
-                            <w:vAlign w:val="center"/>
-                          </w:tcPr>
-                          <w:p>
-                            <w:pPr>
-                              <w:spacing w:after="0" w:line="240" w:lineRule="auto"/>
-                            </w:pPr>
-                            <w:r>
-                              <w:rPr>
-                                <w:color w:val="000000"/>
-                                <w:sz w:val="48"/>
-                                <w:szCs w:val="48"/>
-                              </w:rPr>
-                              <w:t>DDL, definición</w:t>
-                            </w:r>
-                          </w:p>
-                        </w:tc>
-                      </w:tr>
-                      <w:tr>
-                        <w:trPr>
-                          <w:cantSplit/>
-                          <w:jc w:val="center"/>
-                        </w:trPr>
-                        <w:tc>
-                          <w:tcPr>
-                            <w:tcW w:w="4133" w:type="dxa"/>
-                            <w:vAlign w:val="center"/>
-                          </w:tcPr>
-                          <w:p>
-                            <w:pPr>
-                              <w:spacing w:after="0" w:line="240" w:lineRule="auto"/>
-                            </w:pPr>
-                            <w:r>
-                              <w:rPr>
-                                <w:rFonts w:ascii="Consolas" w:hAnsi="Consolas" w:cs="Consolas"/>
-                                <w:color w:val="000000"/>
-                                <w:sz w:val="48"/>
-                                <w:szCs w:val="48"/>
-                              </w:rPr>
-                              <w:t>DELETE</w:t>
-                            </w:r>
-                          </w:p>
-                        </w:tc>
-                        <w:tc>
-                          <w:tcPr>
-                            <w:tcW w:w="8267" w:type="dxa"/>
-                            <w:vAlign w:val="center"/>
-                          </w:tcPr>
-                          <w:p>
-                            <w:pPr>
-                              <w:spacing w:after="0" w:line="240" w:lineRule="auto"/>
-                            </w:pPr>
-                            <w:r>
-                              <w:rPr>
-                                <w:color w:val="000000"/>
-                                <w:sz w:val="48"/>
-                                <w:szCs w:val="48"/>
-                              </w:rPr>
-                              <w:t>DML, manipulación</w:t>
-                            </w:r>
-                          </w:p>
-                        </w:tc>
-                      </w:tr>
-                      <w:tr>
-                        <w:trPr>
-                          <w:cantSplit/>
-                          <w:jc w:val="center"/>
-                        </w:trPr>
-                        <w:tc>
-                          <w:tcPr>
-                            <w:tcW w:w="4133" w:type="dxa"/>
-                            <w:vAlign w:val="center"/>
-                          </w:tcPr>
-                          <w:p>
-                            <w:pPr>
-                              <w:spacing w:after="0" w:line="240" w:lineRule="auto"/>
-                            </w:pPr>
-                            <w:r>
-                              <w:rPr>
-                                <w:rFonts w:ascii="Consolas" w:hAnsi="Consolas" w:cs="Consolas"/>
-                                <w:color w:val="000000"/>
-                                <w:sz w:val="48"/>
-                                <w:szCs w:val="48"/>
-                              </w:rPr>
-                              <w:t>REVOKE</w:t>
-                            </w:r>
-                          </w:p>
-                        </w:tc>
-                        <w:tc>
-                          <w:tcPr>
-                            <w:tcW w:w="8267" w:type="dxa"/>
-                            <w:vAlign w:val="center"/>
-                          </w:tcPr>
-                          <w:p>
-                            <w:pPr>
-                              <w:spacing w:after="0" w:line="240" w:lineRule="auto"/>
-                            </w:pPr>
-                            <w:r>
-                              <w:rPr>
-                                <w:color w:val="000000"/>
-                                <w:sz w:val="48"/>
-                                <w:szCs w:val="48"/>
-                              </w:rPr>
-                              <w:t>DCL, control</w:t>
-                            </w:r>
-                          </w:p>
-                        </w:tc>
-                      </w:tr>
-                      <w:tr>
-                        <w:trPr>
-                          <w:cantSplit/>
-                          <w:jc w:val="center"/>
-                        </w:trPr>
-                        <w:tc>
-                          <w:tcPr>
-                            <w:tcW w:w="4133" w:type="dxa"/>
-                            <w:vAlign w:val="center"/>
-                          </w:tcPr>
-                          <w:p>
-                            <w:pPr>
-                              <w:spacing w:after="0" w:line="240" w:lineRule="auto"/>
-                            </w:pPr>
-                            <w:r>
-                              <w:rPr>
-                                <w:rFonts w:ascii="Consolas" w:hAnsi="Consolas" w:cs="Consolas"/>
-                                <w:color w:val="000000"/>
-                                <w:sz w:val="48"/>
-                                <w:szCs w:val="48"/>
-                              </w:rPr>
-                              <w:t>UPDATE</w:t>
-                            </w:r>
-                          </w:p>
-                        </w:tc>
-                        <w:tc>
-                          <w:tcPr>
-                            <w:tcW w:w="8267" w:type="dxa"/>
-                            <w:vAlign w:val="center"/>
-                          </w:tcPr>
-                          <w:p>
-                            <w:pPr>
-                              <w:spacing w:after="0" w:line="240" w:lineRule="auto"/>
-                            </w:pPr>
-                            <w:r>
-                              <w:rPr>
-                                <w:color w:val="000000"/>
-                                <w:sz w:val="48"/>
-                                <w:szCs w:val="48"/>
-                              </w:rPr>
-                              <w:t>DML, manipulación</w:t>
-                            </w:r>
-                          </w:p>
-                        </w:tc>
-                      </w:tr>
-                    </w:tbl>
-                    <w:p>
-                      <w:pPr>
-                        <w:spacing w:after="0" w:line="240" w:lineRule="auto"/>
-                      </w:pPr>
-                    </w:p>
-                  </w:txbxContent>
-                </v:textbox>
-                <w10:wrap anchorx="margin"/>
-              </v:shape>
-            </w:pict>
+            <w:t>[Cuadro de texto]</w:t>
           </mc:Fallback>
         </mc:AlternateContent>
       </w:r>

</xml_diff>